<commit_message>
plan(follow-ups): materialize 8 evidence-based follow-up items HXC-131..138 (§11.4.93)
From this session's deep analysis. HXC-131 cognee auth drift, HXC-132 compose Dockerfile.test path +
server:8080 test-config, HXC-133 Azure factory test ambient-env, HXC-134 verifier model_id type,
HXC-135 verifier emit capability flags, HXC-136 remaining test-type coverage (ddos/scaling/stress/ui/ux),
HXC-137 owned-submodule health sweep, HXC-138 e2e challenge execution. Queue=14 Queued. diff in-sync.

Co-Authored-By: Claude Opus 4.8 <noreply@anthropic.com>
</commit_message>
<xml_diff>
--- a/docs/Issues.docx
+++ b/docs/Issues.docx
@@ -2,7 +2,7 @@
 <file path=word/document.xml><?xml version="1.0" encoding="utf-8"?>
 <w:document xmlns:w="http://schemas.openxmlformats.org/wordprocessingml/2006/main" xmlns:m="http://schemas.openxmlformats.org/officeDocument/2006/math" xmlns:r="http://schemas.openxmlformats.org/officeDocument/2006/relationships" xmlns:o="urn:schemas-microsoft-com:office:office" xmlns:v="urn:schemas-microsoft-com:vml" xmlns:w10="urn:schemas-microsoft-com:office:word" xmlns:a="http://schemas.openxmlformats.org/drawingml/2006/main" xmlns:pic="http://schemas.openxmlformats.org/drawingml/2006/picture" xmlns:wp="http://schemas.openxmlformats.org/drawingml/2006/wordprocessingDrawing">
   <w:body>
-    <w:bookmarkStart w:id="57" w:name="helixcode-open-issues-tracker"/>
+    <w:bookmarkStart w:id="65" w:name="helixcode-open-issues-tracker"/>
     <w:p>
       <w:pPr>
         <w:pStyle w:val="Heading1"/>
@@ -19905,7 +19905,679 @@
       </w:r>
     </w:p>
     <w:bookmarkEnd w:id="56"/>
+    <w:bookmarkStart w:id="57" w:name="X68ae13fe03bcfe6e43da35677810dc9664e29a3"/>
+    <w:p>
+      <w:pPr>
+        <w:pStyle w:val="Heading2"/>
+      </w:pPr>
+      <w:r>
+        <w:t xml:space="preserve">HXC-131 — Cognee client authentication and bearer-token caching regressed</w:t>
+      </w:r>
+    </w:p>
+    <w:p>
+      <w:pPr>
+        <w:pStyle w:val="FirstParagraph"/>
+      </w:pPr>
+      <w:r>
+        <w:rPr>
+          <w:b/>
+          <w:bCs/>
+        </w:rPr>
+        <w:t xml:space="preserve">Status:</w:t>
+      </w:r>
+      <w:r>
+        <w:t xml:space="preserve"> </w:t>
+      </w:r>
+      <w:r>
+        <w:t xml:space="preserve">Queued</w:t>
+      </w:r>
+      <w:r>
+        <w:t xml:space="preserve"> </w:t>
+      </w:r>
+      <w:r>
+        <w:rPr>
+          <w:b/>
+          <w:bCs/>
+        </w:rPr>
+        <w:t xml:space="preserve">Type:</w:t>
+      </w:r>
+      <w:r>
+        <w:t xml:space="preserve"> </w:t>
+      </w:r>
+      <w:r>
+        <w:t xml:space="preserve">Bug</w:t>
+      </w:r>
+      <w:r>
+        <w:t xml:space="preserve"> </w:t>
+      </w:r>
+      <w:r>
+        <w:rPr>
+          <w:b/>
+          <w:bCs/>
+        </w:rPr>
+        <w:t xml:space="preserve">Severity:</w:t>
+      </w:r>
+      <w:r>
+        <w:t xml:space="preserve"> </w:t>
+      </w:r>
+      <w:r>
+        <w:t xml:space="preserve">Medium</w:t>
+      </w:r>
+      <w:r>
+        <w:t xml:space="preserve"> </w:t>
+      </w:r>
+      <w:r>
+        <w:rPr>
+          <w:b/>
+          <w:bCs/>
+        </w:rPr>
+        <w:t xml:space="preserve">Created-By:</w:t>
+      </w:r>
+      <w:r>
+        <w:t xml:space="preserve"> </w:t>
+      </w:r>
+      <w:r>
+        <w:t xml:space="preserve">Claude</w:t>
+      </w:r>
+    </w:p>
+    <w:p>
+      <w:pPr>
+        <w:pStyle w:val="BodyText"/>
+      </w:pPr>
+      <w:r>
+        <w:t xml:space="preserve">The client that talks to the Cognee memory service stopped completing its login and caching the access token — its tests show the login endpoint is never called and no bearer token is stored, so authenticated calls would fail. This means memory features that rely on Cognee cannot authenticate reliably. The work is to restore the login-then-cache-token flow and prove it with the existing auth tests. Users regain dependable access to Cognee-backed memory.</w:t>
+      </w:r>
+    </w:p>
     <w:bookmarkEnd w:id="57"/>
+    <w:bookmarkStart w:id="58" w:name="Xbff0032a6fefe8568cce2ea9af75fb4e11d3a07"/>
+    <w:p>
+      <w:pPr>
+        <w:pStyle w:val="Heading2"/>
+      </w:pPr>
+      <w:r>
+        <w:t xml:space="preserve">HXC-132 — Full-test container stack cannot build the HelixCode server and tests hardcode port 8080</w:t>
+      </w:r>
+    </w:p>
+    <w:p>
+      <w:pPr>
+        <w:pStyle w:val="FirstParagraph"/>
+      </w:pPr>
+      <w:r>
+        <w:rPr>
+          <w:b/>
+          <w:bCs/>
+        </w:rPr>
+        <w:t xml:space="preserve">Status:</w:t>
+      </w:r>
+      <w:r>
+        <w:t xml:space="preserve"> </w:t>
+      </w:r>
+      <w:r>
+        <w:t xml:space="preserve">Queued</w:t>
+      </w:r>
+      <w:r>
+        <w:t xml:space="preserve"> </w:t>
+      </w:r>
+      <w:r>
+        <w:rPr>
+          <w:b/>
+          <w:bCs/>
+        </w:rPr>
+        <w:t xml:space="preserve">Type:</w:t>
+      </w:r>
+      <w:r>
+        <w:t xml:space="preserve"> </w:t>
+      </w:r>
+      <w:r>
+        <w:t xml:space="preserve">Task</w:t>
+      </w:r>
+      <w:r>
+        <w:t xml:space="preserve"> </w:t>
+      </w:r>
+      <w:r>
+        <w:rPr>
+          <w:b/>
+          <w:bCs/>
+        </w:rPr>
+        <w:t xml:space="preserve">Severity:</w:t>
+      </w:r>
+      <w:r>
+        <w:t xml:space="preserve"> </w:t>
+      </w:r>
+      <w:r>
+        <w:t xml:space="preserve">Medium</w:t>
+      </w:r>
+      <w:r>
+        <w:t xml:space="preserve"> </w:t>
+      </w:r>
+      <w:r>
+        <w:rPr>
+          <w:b/>
+          <w:bCs/>
+        </w:rPr>
+        <w:t xml:space="preserve">Created-By:</w:t>
+      </w:r>
+      <w:r>
+        <w:t xml:space="preserve"> </w:t>
+      </w:r>
+      <w:r>
+        <w:t xml:space="preserve">Claude</w:t>
+      </w:r>
+    </w:p>
+    <w:p>
+      <w:pPr>
+        <w:pStyle w:val="BodyText"/>
+      </w:pPr>
+      <w:r>
+        <w:t xml:space="preserve">The full-infrastructure test stack fails to build the HelixCode server container because its build recipe points at a Dockerfile path that does not exist, and many memory and security tests skip themselves because they look for a server on a fixed port 8080 with no way to override it. As a result a whole class of tests never run against a real server. The work is to fix the container build path and make the server URL configurable so those tests execute. This unlocks real end-to-end coverage of server-dependent features.</w:t>
+      </w:r>
+    </w:p>
+    <w:bookmarkEnd w:id="58"/>
+    <w:bookmarkStart w:id="59" w:name="Xc4850058affb934a790611aa86e80698fb7a9d4"/>
+    <w:p>
+      <w:pPr>
+        <w:pStyle w:val="Heading2"/>
+      </w:pPr>
+      <w:r>
+        <w:t xml:space="preserve">HXC-133 — Azure provider factory test assumes an ambient endpoint environment variable</w:t>
+      </w:r>
+    </w:p>
+    <w:p>
+      <w:pPr>
+        <w:pStyle w:val="FirstParagraph"/>
+      </w:pPr>
+      <w:r>
+        <w:rPr>
+          <w:b/>
+          <w:bCs/>
+        </w:rPr>
+        <w:t xml:space="preserve">Status:</w:t>
+      </w:r>
+      <w:r>
+        <w:t xml:space="preserve"> </w:t>
+      </w:r>
+      <w:r>
+        <w:t xml:space="preserve">Queued</w:t>
+      </w:r>
+      <w:r>
+        <w:t xml:space="preserve"> </w:t>
+      </w:r>
+      <w:r>
+        <w:rPr>
+          <w:b/>
+          <w:bCs/>
+        </w:rPr>
+        <w:t xml:space="preserve">Type:</w:t>
+      </w:r>
+      <w:r>
+        <w:t xml:space="preserve"> </w:t>
+      </w:r>
+      <w:r>
+        <w:t xml:space="preserve">Bug</w:t>
+      </w:r>
+      <w:r>
+        <w:t xml:space="preserve"> </w:t>
+      </w:r>
+      <w:r>
+        <w:rPr>
+          <w:b/>
+          <w:bCs/>
+        </w:rPr>
+        <w:t xml:space="preserve">Severity:</w:t>
+      </w:r>
+      <w:r>
+        <w:t xml:space="preserve"> </w:t>
+      </w:r>
+      <w:r>
+        <w:t xml:space="preserve">Low</w:t>
+      </w:r>
+      <w:r>
+        <w:t xml:space="preserve"> </w:t>
+      </w:r>
+      <w:r>
+        <w:rPr>
+          <w:b/>
+          <w:bCs/>
+        </w:rPr>
+        <w:t xml:space="preserve">Created-By:</w:t>
+      </w:r>
+      <w:r>
+        <w:t xml:space="preserve"> </w:t>
+      </w:r>
+      <w:r>
+        <w:t xml:space="preserve">Claude</w:t>
+      </w:r>
+    </w:p>
+    <w:p>
+      <w:pPr>
+        <w:pStyle w:val="BodyText"/>
+      </w:pPr>
+      <w:r>
+        <w:t xml:space="preserve">One Azure-provider test quietly depends on an endpoint value being present in the environment; when that value is injected by the full-test setup the test’s assumptions no longer hold. It does not crash, but it is fragile and can give misleading results depending on the environment. The work is to make the test hermetic (control its own environment) like the sibling test already fixed. This makes the Azure test suite reliable regardless of how it is run.</w:t>
+      </w:r>
+    </w:p>
+    <w:bookmarkEnd w:id="59"/>
+    <w:bookmarkStart w:id="60" w:name="Xf1114caceba800a6f1430f14ec389464028173a"/>
+    <w:p>
+      <w:pPr>
+        <w:pStyle w:val="Heading2"/>
+      </w:pPr>
+      <w:r>
+        <w:t xml:space="preserve">HXC-134 — Model verifier returns the model id as a number but the platform expects text</w:t>
+      </w:r>
+    </w:p>
+    <w:p>
+      <w:pPr>
+        <w:pStyle w:val="FirstParagraph"/>
+      </w:pPr>
+      <w:r>
+        <w:rPr>
+          <w:b/>
+          <w:bCs/>
+        </w:rPr>
+        <w:t xml:space="preserve">Status:</w:t>
+      </w:r>
+      <w:r>
+        <w:t xml:space="preserve"> </w:t>
+      </w:r>
+      <w:r>
+        <w:t xml:space="preserve">Queued</w:t>
+      </w:r>
+      <w:r>
+        <w:t xml:space="preserve"> </w:t>
+      </w:r>
+      <w:r>
+        <w:rPr>
+          <w:b/>
+          <w:bCs/>
+        </w:rPr>
+        <w:t xml:space="preserve">Type:</w:t>
+      </w:r>
+      <w:r>
+        <w:t xml:space="preserve"> </w:t>
+      </w:r>
+      <w:r>
+        <w:t xml:space="preserve">Bug</w:t>
+      </w:r>
+      <w:r>
+        <w:t xml:space="preserve"> </w:t>
+      </w:r>
+      <w:r>
+        <w:rPr>
+          <w:b/>
+          <w:bCs/>
+        </w:rPr>
+        <w:t xml:space="preserve">Severity:</w:t>
+      </w:r>
+      <w:r>
+        <w:t xml:space="preserve"> </w:t>
+      </w:r>
+      <w:r>
+        <w:t xml:space="preserve">Medium</w:t>
+      </w:r>
+      <w:r>
+        <w:t xml:space="preserve"> </w:t>
+      </w:r>
+      <w:r>
+        <w:rPr>
+          <w:b/>
+          <w:bCs/>
+        </w:rPr>
+        <w:t xml:space="preserve">Created-By:</w:t>
+      </w:r>
+      <w:r>
+        <w:t xml:space="preserve"> </w:t>
+      </w:r>
+      <w:r>
+        <w:t xml:space="preserve">Claude</w:t>
+      </w:r>
+    </w:p>
+    <w:p>
+      <w:pPr>
+        <w:pStyle w:val="BodyText"/>
+      </w:pPr>
+      <w:r>
+        <w:t xml:space="preserve">The central model-verifier service reports each model’s id as a numeric value, while HelixCode expects the id as text — a type mismatch that can break how verified models are matched and displayed. The work is to align the two so the id is consistently text end to end. Correct model identity keeps verification, listing, and status accurate for users.</w:t>
+      </w:r>
+    </w:p>
+    <w:bookmarkEnd w:id="60"/>
+    <w:bookmarkStart w:id="61" w:name="X82f99c18ed6eebcfd6dc6dfb7ef1b605b293948"/>
+    <w:p>
+      <w:pPr>
+        <w:pStyle w:val="Heading2"/>
+      </w:pPr>
+      <w:r>
+        <w:t xml:space="preserve">HXC-135 — Model verifier should publish the six advanced-capability flags so the platform can show them</w:t>
+      </w:r>
+    </w:p>
+    <w:p>
+      <w:pPr>
+        <w:pStyle w:val="FirstParagraph"/>
+      </w:pPr>
+      <w:r>
+        <w:rPr>
+          <w:b/>
+          <w:bCs/>
+        </w:rPr>
+        <w:t xml:space="preserve">Status:</w:t>
+      </w:r>
+      <w:r>
+        <w:t xml:space="preserve"> </w:t>
+      </w:r>
+      <w:r>
+        <w:t xml:space="preserve">Queued</w:t>
+      </w:r>
+      <w:r>
+        <w:t xml:space="preserve"> </w:t>
+      </w:r>
+      <w:r>
+        <w:rPr>
+          <w:b/>
+          <w:bCs/>
+        </w:rPr>
+        <w:t xml:space="preserve">Type:</w:t>
+      </w:r>
+      <w:r>
+        <w:t xml:space="preserve"> </w:t>
+      </w:r>
+      <w:r>
+        <w:t xml:space="preserve">Feature</w:t>
+      </w:r>
+      <w:r>
+        <w:t xml:space="preserve"> </w:t>
+      </w:r>
+      <w:r>
+        <w:rPr>
+          <w:b/>
+          <w:bCs/>
+        </w:rPr>
+        <w:t xml:space="preserve">Severity:</w:t>
+      </w:r>
+      <w:r>
+        <w:t xml:space="preserve"> </w:t>
+      </w:r>
+      <w:r>
+        <w:t xml:space="preserve">Medium</w:t>
+      </w:r>
+      <w:r>
+        <w:t xml:space="preserve"> </w:t>
+      </w:r>
+      <w:r>
+        <w:rPr>
+          <w:b/>
+          <w:bCs/>
+        </w:rPr>
+        <w:t xml:space="preserve">Created-By:</w:t>
+      </w:r>
+      <w:r>
+        <w:t xml:space="preserve"> </w:t>
+      </w:r>
+      <w:r>
+        <w:t xml:space="preserve">Claude</w:t>
+      </w:r>
+    </w:p>
+    <w:p>
+      <w:pPr>
+        <w:pStyle w:val="BodyText"/>
+      </w:pPr>
+      <w:r>
+        <w:t xml:space="preserve">HelixCode is now wired to read six advanced capability indicators (tool protocols, code intelligence, retrieval, skills, plugins) from the central verifier, but the verifier’s live responses do not yet include those fields, so the flags always read as unsupported. The work is to have the verifier publish these capability values it already computes. Then users see accurate per-model capability information across the product.</w:t>
+      </w:r>
+    </w:p>
+    <w:bookmarkEnd w:id="61"/>
+    <w:bookmarkStart w:id="62" w:name="X14cf2054f0d6232efe903a1c4542755a8432c0d"/>
+    <w:p>
+      <w:pPr>
+        <w:pStyle w:val="Heading2"/>
+      </w:pPr>
+      <w:r>
+        <w:t xml:space="preserve">HXC-136 — Verify the remaining automated test types run with real captured evidence</w:t>
+      </w:r>
+    </w:p>
+    <w:p>
+      <w:pPr>
+        <w:pStyle w:val="FirstParagraph"/>
+      </w:pPr>
+      <w:r>
+        <w:rPr>
+          <w:b/>
+          <w:bCs/>
+        </w:rPr>
+        <w:t xml:space="preserve">Status:</w:t>
+      </w:r>
+      <w:r>
+        <w:t xml:space="preserve"> </w:t>
+      </w:r>
+      <w:r>
+        <w:t xml:space="preserve">Queued</w:t>
+      </w:r>
+      <w:r>
+        <w:t xml:space="preserve"> </w:t>
+      </w:r>
+      <w:r>
+        <w:rPr>
+          <w:b/>
+          <w:bCs/>
+        </w:rPr>
+        <w:t xml:space="preserve">Type:</w:t>
+      </w:r>
+      <w:r>
+        <w:t xml:space="preserve"> </w:t>
+      </w:r>
+      <w:r>
+        <w:t xml:space="preserve">Task</w:t>
+      </w:r>
+      <w:r>
+        <w:t xml:space="preserve"> </w:t>
+      </w:r>
+      <w:r>
+        <w:rPr>
+          <w:b/>
+          <w:bCs/>
+        </w:rPr>
+        <w:t xml:space="preserve">Severity:</w:t>
+      </w:r>
+      <w:r>
+        <w:t xml:space="preserve"> </w:t>
+      </w:r>
+      <w:r>
+        <w:t xml:space="preserve">Medium</w:t>
+      </w:r>
+      <w:r>
+        <w:t xml:space="preserve"> </w:t>
+      </w:r>
+      <w:r>
+        <w:rPr>
+          <w:b/>
+          <w:bCs/>
+        </w:rPr>
+        <w:t xml:space="preserve">Created-By:</w:t>
+      </w:r>
+      <w:r>
+        <w:t xml:space="preserve"> </w:t>
+      </w:r>
+      <w:r>
+        <w:t xml:space="preserve">Claude</w:t>
+      </w:r>
+    </w:p>
+    <w:p>
+      <w:pPr>
+        <w:pStyle w:val="BodyText"/>
+      </w:pPr>
+      <w:r>
+        <w:t xml:space="preserve">Several mandated automated test categories — load/denial-of-service, scaling, stress and chaos, and user-interface/experience — were not exercised in the latest real-infrastructure run, so their current health is unconfirmed. The work is to run each of these test types against real infrastructure and capture proof of the results. This completes the promised full test-type coverage and confirms the product holds up under load and adverse conditions.</w:t>
+      </w:r>
+    </w:p>
+    <w:bookmarkEnd w:id="62"/>
+    <w:bookmarkStart w:id="63" w:name="X93a4629179f8f26f2f3b3874a318ce7dbf58ebf"/>
+    <w:p>
+      <w:pPr>
+        <w:pStyle w:val="Heading2"/>
+      </w:pPr>
+      <w:r>
+        <w:t xml:space="preserve">HXC-137 — Re-verify every owned code module builds, checks, and tests cleanly</w:t>
+      </w:r>
+    </w:p>
+    <w:p>
+      <w:pPr>
+        <w:pStyle w:val="FirstParagraph"/>
+      </w:pPr>
+      <w:r>
+        <w:rPr>
+          <w:b/>
+          <w:bCs/>
+        </w:rPr>
+        <w:t xml:space="preserve">Status:</w:t>
+      </w:r>
+      <w:r>
+        <w:t xml:space="preserve"> </w:t>
+      </w:r>
+      <w:r>
+        <w:t xml:space="preserve">Queued</w:t>
+      </w:r>
+      <w:r>
+        <w:t xml:space="preserve"> </w:t>
+      </w:r>
+      <w:r>
+        <w:rPr>
+          <w:b/>
+          <w:bCs/>
+        </w:rPr>
+        <w:t xml:space="preserve">Type:</w:t>
+      </w:r>
+      <w:r>
+        <w:t xml:space="preserve"> </w:t>
+      </w:r>
+      <w:r>
+        <w:t xml:space="preserve">Task</w:t>
+      </w:r>
+      <w:r>
+        <w:t xml:space="preserve"> </w:t>
+      </w:r>
+      <w:r>
+        <w:rPr>
+          <w:b/>
+          <w:bCs/>
+        </w:rPr>
+        <w:t xml:space="preserve">Severity:</w:t>
+      </w:r>
+      <w:r>
+        <w:t xml:space="preserve"> </w:t>
+      </w:r>
+      <w:r>
+        <w:t xml:space="preserve">Medium</w:t>
+      </w:r>
+      <w:r>
+        <w:t xml:space="preserve"> </w:t>
+      </w:r>
+      <w:r>
+        <w:rPr>
+          <w:b/>
+          <w:bCs/>
+        </w:rPr>
+        <w:t xml:space="preserve">Created-By:</w:t>
+      </w:r>
+      <w:r>
+        <w:t xml:space="preserve"> </w:t>
+      </w:r>
+      <w:r>
+        <w:t xml:space="preserve">Claude</w:t>
+      </w:r>
+    </w:p>
+    <w:p>
+      <w:pPr>
+        <w:pStyle w:val="BodyText"/>
+      </w:pPr>
+      <w:r>
+        <w:t xml:space="preserve">The project depends on many owned code modules, and a full health check of all of them (does each build, pass static checks, and pass its tests) did not finish in the latest session. The work is to run that complete health sweep and record the result for every module. This assures that the whole codebase, not just the main application, is in good shape.</w:t>
+      </w:r>
+    </w:p>
+    <w:bookmarkEnd w:id="63"/>
+    <w:bookmarkStart w:id="64" w:name="Xe5c0b9484c2706131a5e705eca910482f01e090"/>
+    <w:p>
+      <w:pPr>
+        <w:pStyle w:val="Heading2"/>
+      </w:pPr>
+      <w:r>
+        <w:t xml:space="preserve">HXC-138 — Run the end-to-end challenge suite against a running server</w:t>
+      </w:r>
+    </w:p>
+    <w:p>
+      <w:pPr>
+        <w:pStyle w:val="FirstParagraph"/>
+      </w:pPr>
+      <w:r>
+        <w:rPr>
+          <w:b/>
+          <w:bCs/>
+        </w:rPr>
+        <w:t xml:space="preserve">Status:</w:t>
+      </w:r>
+      <w:r>
+        <w:t xml:space="preserve"> </w:t>
+      </w:r>
+      <w:r>
+        <w:t xml:space="preserve">Queued</w:t>
+      </w:r>
+      <w:r>
+        <w:t xml:space="preserve"> </w:t>
+      </w:r>
+      <w:r>
+        <w:rPr>
+          <w:b/>
+          <w:bCs/>
+        </w:rPr>
+        <w:t xml:space="preserve">Type:</w:t>
+      </w:r>
+      <w:r>
+        <w:t xml:space="preserve"> </w:t>
+      </w:r>
+      <w:r>
+        <w:t xml:space="preserve">Task</w:t>
+      </w:r>
+      <w:r>
+        <w:t xml:space="preserve"> </w:t>
+      </w:r>
+      <w:r>
+        <w:rPr>
+          <w:b/>
+          <w:bCs/>
+        </w:rPr>
+        <w:t xml:space="preserve">Severity:</w:t>
+      </w:r>
+      <w:r>
+        <w:t xml:space="preserve"> </w:t>
+      </w:r>
+      <w:r>
+        <w:t xml:space="preserve">Low</w:t>
+      </w:r>
+      <w:r>
+        <w:t xml:space="preserve"> </w:t>
+      </w:r>
+      <w:r>
+        <w:rPr>
+          <w:b/>
+          <w:bCs/>
+        </w:rPr>
+        <w:t xml:space="preserve">Created-By:</w:t>
+      </w:r>
+      <w:r>
+        <w:t xml:space="preserve"> </w:t>
+      </w:r>
+      <w:r>
+        <w:t xml:space="preserve">Claude</w:t>
+      </w:r>
+    </w:p>
+    <w:p>
+      <w:pPr>
+        <w:pStyle w:val="BodyText"/>
+      </w:pPr>
+      <w:r>
+        <w:t xml:space="preserve">The end-to-end challenge runner can now launch all its scenarios (a missing option was just fixed), but the scenarios still need to be executed against a live server with a real model to confirm the complete user journeys work. The work is to stand up a server and run the challenges, capturing the results. This provides real proof that the headline user workflows function end to end.</w:t>
+      </w:r>
+    </w:p>
+    <w:bookmarkEnd w:id="64"/>
+    <w:bookmarkEnd w:id="65"/>
     <w:sectPr>
       <w:footnotePr>
         <w:numRestart w:val="eachSect"/>

</xml_diff>

<commit_message>
track(HXC-142..146): file 5 new defects surfaced by the real-infra retest (§11.4.118)
HXC-142 (Bug/High): test/automation doesn't compile (provider API drift + dup-symbol).
HXC-143 (Bug/High): test/e2e doesn't compile (getEnvOrDefault redeclared).
HXC-144 (Bug/Med): server goroutine-leak under DDoS-flood (delta 5>tol 4).
HXC-145 (Bug/Low): Xiaomi rejects configured model mimo-v2-flash.
HXC-146 (Task/Med): challenge-runner interfaces don't drive server HTTP API.
All cite docs/qa/infra_retest_20260712_hxc122_138/ evidence. DB→docs regenerated, gates PASS.

Co-Authored-By: Claude Opus 4.8 <noreply@anthropic.com>
</commit_message>
<xml_diff>
--- a/docs/Issues.docx
+++ b/docs/Issues.docx
@@ -2,7 +2,7 @@
 <file path=word/document.xml><?xml version="1.0" encoding="utf-8"?>
 <w:document xmlns:w="http://schemas.openxmlformats.org/wordprocessingml/2006/main" xmlns:m="http://schemas.openxmlformats.org/officeDocument/2006/math" xmlns:r="http://schemas.openxmlformats.org/officeDocument/2006/relationships" xmlns:o="urn:schemas-microsoft-com:office:office" xmlns:v="urn:schemas-microsoft-com:vml" xmlns:w10="urn:schemas-microsoft-com:office:word" xmlns:a="http://schemas.openxmlformats.org/drawingml/2006/main" xmlns:pic="http://schemas.openxmlformats.org/drawingml/2006/picture" xmlns:wp="http://schemas.openxmlformats.org/drawingml/2006/wordprocessingDrawing">
   <w:body>
-    <w:bookmarkStart w:id="16" w:name="helixcode-open-issues-tracker"/>
+    <w:bookmarkStart w:id="21" w:name="helixcode-open-issues-tracker"/>
     <w:p>
       <w:pPr>
         <w:pStyle w:val="Heading1"/>
@@ -2609,7 +2609,427 @@
       </w:r>
     </w:p>
     <w:bookmarkEnd w:id="15"/>
+    <w:bookmarkStart w:id="16" w:name="Xbe03d6ca0453f7b0834e244be7a142ce1b56fd5"/>
+    <w:p>
+      <w:pPr>
+        <w:pStyle w:val="Heading2"/>
+      </w:pPr>
+      <w:r>
+        <w:t xml:space="preserve">HXC-142 — Automation test suite (test/automation, -tags=automation) does not compile</w:t>
+      </w:r>
+    </w:p>
+    <w:p>
+      <w:pPr>
+        <w:pStyle w:val="FirstParagraph"/>
+      </w:pPr>
+      <w:r>
+        <w:rPr>
+          <w:b/>
+          <w:bCs/>
+        </w:rPr>
+        <w:t xml:space="preserve">Status:</w:t>
+      </w:r>
+      <w:r>
+        <w:t xml:space="preserve"> </w:t>
+      </w:r>
+      <w:r>
+        <w:t xml:space="preserve">Queued</w:t>
+      </w:r>
+      <w:r>
+        <w:t xml:space="preserve"> </w:t>
+      </w:r>
+      <w:r>
+        <w:rPr>
+          <w:b/>
+          <w:bCs/>
+        </w:rPr>
+        <w:t xml:space="preserve">Type:</w:t>
+      </w:r>
+      <w:r>
+        <w:t xml:space="preserve"> </w:t>
+      </w:r>
+      <w:r>
+        <w:t xml:space="preserve">Bug</w:t>
+      </w:r>
+      <w:r>
+        <w:t xml:space="preserve"> </w:t>
+      </w:r>
+      <w:r>
+        <w:rPr>
+          <w:b/>
+          <w:bCs/>
+        </w:rPr>
+        <w:t xml:space="preserve">Severity:</w:t>
+      </w:r>
+      <w:r>
+        <w:t xml:space="preserve"> </w:t>
+      </w:r>
+      <w:r>
+        <w:t xml:space="preserve">High</w:t>
+      </w:r>
+      <w:r>
+        <w:t xml:space="preserve"> </w:t>
+      </w:r>
+      <w:r>
+        <w:rPr>
+          <w:b/>
+          <w:bCs/>
+        </w:rPr>
+        <w:t xml:space="preserve">Created-By:</w:t>
+      </w:r>
+      <w:r>
+        <w:t xml:space="preserve"> </w:t>
+      </w:r>
+      <w:r>
+        <w:t xml:space="preserve">Claude</w:t>
+      </w:r>
+    </w:p>
+    <w:p>
+      <w:pPr>
+        <w:pStyle w:val="BodyText"/>
+      </w:pPr>
+      <w:r>
+        <w:t xml:space="preserve">The automation-tagged test package fails to build, so an entire mandated test type cannot execute at all. Two real causes were found during the 2026-07-12 real-infra retest: a duplicate symbol (isRateLimitError/contains declared in both xai and qwen automation test files) and deeper API drift where the tests reference llm.ProviderConfig and NewProviderManager which no longer exist in the current provider package. The work is to reconcile the automation tests with the current provider API and remove the duplicate helpers so the suite compiles and runs against real infrastructure. Evidence: docs/qa/infra_retest_20260712_hxc122_138/automation_tests.log.</w:t>
+      </w:r>
+    </w:p>
     <w:bookmarkEnd w:id="16"/>
+    <w:bookmarkStart w:id="17" w:name="X054ad3b558f7674e0fadf688fd66524f38df1ce"/>
+    <w:p>
+      <w:pPr>
+        <w:pStyle w:val="Heading2"/>
+      </w:pPr>
+      <w:r>
+        <w:t xml:space="preserve">HXC-143 — E2E test suite (test/e2e, -tags=e2e) does not compile due to redeclared getEnvOrDefault</w:t>
+      </w:r>
+    </w:p>
+    <w:p>
+      <w:pPr>
+        <w:pStyle w:val="FirstParagraph"/>
+      </w:pPr>
+      <w:r>
+        <w:rPr>
+          <w:b/>
+          <w:bCs/>
+        </w:rPr>
+        <w:t xml:space="preserve">Status:</w:t>
+      </w:r>
+      <w:r>
+        <w:t xml:space="preserve"> </w:t>
+      </w:r>
+      <w:r>
+        <w:t xml:space="preserve">Queued</w:t>
+      </w:r>
+      <w:r>
+        <w:t xml:space="preserve"> </w:t>
+      </w:r>
+      <w:r>
+        <w:rPr>
+          <w:b/>
+          <w:bCs/>
+        </w:rPr>
+        <w:t xml:space="preserve">Type:</w:t>
+      </w:r>
+      <w:r>
+        <w:t xml:space="preserve"> </w:t>
+      </w:r>
+      <w:r>
+        <w:t xml:space="preserve">Bug</w:t>
+      </w:r>
+      <w:r>
+        <w:t xml:space="preserve"> </w:t>
+      </w:r>
+      <w:r>
+        <w:rPr>
+          <w:b/>
+          <w:bCs/>
+        </w:rPr>
+        <w:t xml:space="preserve">Severity:</w:t>
+      </w:r>
+      <w:r>
+        <w:t xml:space="preserve"> </w:t>
+      </w:r>
+      <w:r>
+        <w:t xml:space="preserve">High</w:t>
+      </w:r>
+      <w:r>
+        <w:t xml:space="preserve"> </w:t>
+      </w:r>
+      <w:r>
+        <w:rPr>
+          <w:b/>
+          <w:bCs/>
+        </w:rPr>
+        <w:t xml:space="preserve">Created-By:</w:t>
+      </w:r>
+      <w:r>
+        <w:t xml:space="preserve"> </w:t>
+      </w:r>
+      <w:r>
+        <w:t xml:space="preserve">Claude</w:t>
+      </w:r>
+    </w:p>
+    <w:p>
+      <w:pPr>
+        <w:pStyle w:val="BodyText"/>
+      </w:pPr>
+      <w:r>
+        <w:t xml:space="preserve">The e2e-tagged test package fails to build because getEnvOrDefault is declared more than once in the package, so another mandated test type cannot execute. The work is to remove the duplicate declaration (consolidate to a single shared helper) so the e2e suite compiles and can run end-to-end against a real server. Discovered during the 2026-07-12 real-infra retest. Evidence: docs/qa/infra_retest_20260712_hxc122_138/EVIDENCE.md.</w:t>
+      </w:r>
+    </w:p>
+    <w:bookmarkEnd w:id="17"/>
+    <w:bookmarkStart w:id="18" w:name="Xf7afb59cbef64acf0da7700cc194ddabe925e93"/>
+    <w:p>
+      <w:pPr>
+        <w:pStyle w:val="Heading2"/>
+      </w:pPr>
+      <w:r>
+        <w:t xml:space="preserve">HXC-144 — Server leaks goroutines under sustained DDoS-flood load (chaos test)</w:t>
+      </w:r>
+    </w:p>
+    <w:p>
+      <w:pPr>
+        <w:pStyle w:val="FirstParagraph"/>
+      </w:pPr>
+      <w:r>
+        <w:rPr>
+          <w:b/>
+          <w:bCs/>
+        </w:rPr>
+        <w:t xml:space="preserve">Status:</w:t>
+      </w:r>
+      <w:r>
+        <w:t xml:space="preserve"> </w:t>
+      </w:r>
+      <w:r>
+        <w:t xml:space="preserve">Queued</w:t>
+      </w:r>
+      <w:r>
+        <w:t xml:space="preserve"> </w:t>
+      </w:r>
+      <w:r>
+        <w:rPr>
+          <w:b/>
+          <w:bCs/>
+        </w:rPr>
+        <w:t xml:space="preserve">Type:</w:t>
+      </w:r>
+      <w:r>
+        <w:t xml:space="preserve"> </w:t>
+      </w:r>
+      <w:r>
+        <w:t xml:space="preserve">Bug</w:t>
+      </w:r>
+      <w:r>
+        <w:t xml:space="preserve"> </w:t>
+      </w:r>
+      <w:r>
+        <w:rPr>
+          <w:b/>
+          <w:bCs/>
+        </w:rPr>
+        <w:t xml:space="preserve">Severity:</w:t>
+      </w:r>
+      <w:r>
+        <w:t xml:space="preserve"> </w:t>
+      </w:r>
+      <w:r>
+        <w:t xml:space="preserve">Medium</w:t>
+      </w:r>
+      <w:r>
+        <w:t xml:space="preserve"> </w:t>
+      </w:r>
+      <w:r>
+        <w:rPr>
+          <w:b/>
+          <w:bCs/>
+        </w:rPr>
+        <w:t xml:space="preserve">Created-By:</w:t>
+      </w:r>
+      <w:r>
+        <w:t xml:space="preserve"> </w:t>
+      </w:r>
+      <w:r>
+        <w:t xml:space="preserve">Claude</w:t>
+      </w:r>
+    </w:p>
+    <w:p>
+      <w:pPr>
+        <w:pStyle w:val="BodyText"/>
+      </w:pPr>
+      <w:r>
+        <w:t xml:space="preserve">Under the sustained request-flood chaos test against the real running server, the goroutine count grew by 5 which exceeds the tolerance of 4, signalling a goroutine leak in a request-handling path when the server is hammered. Left unaddressed this degrades long-running server stability under load. The work is to find the leaking goroutine (likely an unclosed channel, context, or connection in a hot handler) and fix it so the count stays within tolerance under flood. Evidence: docs/qa/infra_retest_20260712_hxc122_138/EVIDENCE.md (Server 7/8).</w:t>
+      </w:r>
+    </w:p>
+    <w:bookmarkEnd w:id="18"/>
+    <w:bookmarkStart w:id="19" w:name="X5cd0de2ff8245a6eb254a3c9edeabbe6d1f4b1d"/>
+    <w:p>
+      <w:pPr>
+        <w:pStyle w:val="Heading2"/>
+      </w:pPr>
+      <w:r>
+        <w:t xml:space="preserve">HXC-145 — Configured Xiaomi model mimo-v2-flash is rejected by the real Xiaomi API</w:t>
+      </w:r>
+    </w:p>
+    <w:p>
+      <w:pPr>
+        <w:pStyle w:val="FirstParagraph"/>
+      </w:pPr>
+      <w:r>
+        <w:rPr>
+          <w:b/>
+          <w:bCs/>
+        </w:rPr>
+        <w:t xml:space="preserve">Status:</w:t>
+      </w:r>
+      <w:r>
+        <w:t xml:space="preserve"> </w:t>
+      </w:r>
+      <w:r>
+        <w:t xml:space="preserve">Queued</w:t>
+      </w:r>
+      <w:r>
+        <w:t xml:space="preserve"> </w:t>
+      </w:r>
+      <w:r>
+        <w:rPr>
+          <w:b/>
+          <w:bCs/>
+        </w:rPr>
+        <w:t xml:space="preserve">Type:</w:t>
+      </w:r>
+      <w:r>
+        <w:t xml:space="preserve"> </w:t>
+      </w:r>
+      <w:r>
+        <w:t xml:space="preserve">Bug</w:t>
+      </w:r>
+      <w:r>
+        <w:t xml:space="preserve"> </w:t>
+      </w:r>
+      <w:r>
+        <w:rPr>
+          <w:b/>
+          <w:bCs/>
+        </w:rPr>
+        <w:t xml:space="preserve">Severity:</w:t>
+      </w:r>
+      <w:r>
+        <w:t xml:space="preserve"> </w:t>
+      </w:r>
+      <w:r>
+        <w:t xml:space="preserve">Low</w:t>
+      </w:r>
+      <w:r>
+        <w:t xml:space="preserve"> </w:t>
+      </w:r>
+      <w:r>
+        <w:rPr>
+          <w:b/>
+          <w:bCs/>
+        </w:rPr>
+        <w:t xml:space="preserve">Created-By:</w:t>
+      </w:r>
+      <w:r>
+        <w:t xml:space="preserve"> </w:t>
+      </w:r>
+      <w:r>
+        <w:t xml:space="preserve">Claude</w:t>
+      </w:r>
+    </w:p>
+    <w:p>
+      <w:pPr>
+        <w:pStyle w:val="BodyText"/>
+      </w:pPr>
+      <w:r>
+        <w:t xml:space="preserve">During the real-infra retest the Xiaomi provider chaos tests failed 2 of 5 because the model id configured for Xiaomi (mimo-v2-flash) is rejected by the live Xiaomi API, indicating the configured model name is stale or wrong. Users selecting the Xiaomi provider with that model would get errors. The work is to determine the correct current Xiaomi model id (from the provider or the verifier as single source of truth) and update the configuration so Xiaomi requests succeed. Evidence: docs/qa/infra_retest_20260712_hxc122_138/EVIDENCE.md (Xiaomi 3/5).</w:t>
+      </w:r>
+    </w:p>
+    <w:bookmarkEnd w:id="19"/>
+    <w:bookmarkStart w:id="20" w:name="X1e6955bfb01c2f30828a0de030cdb79ef273697"/>
+    <w:p>
+      <w:pPr>
+        <w:pStyle w:val="Heading2"/>
+      </w:pPr>
+      <w:r>
+        <w:t xml:space="preserve">HXC-146 — E2E challenge runner interfaces (cli/rest/tui/websocket) do not drive the real server HTTP API</w:t>
+      </w:r>
+    </w:p>
+    <w:p>
+      <w:pPr>
+        <w:pStyle w:val="FirstParagraph"/>
+      </w:pPr>
+      <w:r>
+        <w:rPr>
+          <w:b/>
+          <w:bCs/>
+        </w:rPr>
+        <w:t xml:space="preserve">Status:</w:t>
+      </w:r>
+      <w:r>
+        <w:t xml:space="preserve"> </w:t>
+      </w:r>
+      <w:r>
+        <w:t xml:space="preserve">Queued</w:t>
+      </w:r>
+      <w:r>
+        <w:t xml:space="preserve"> </w:t>
+      </w:r>
+      <w:r>
+        <w:rPr>
+          <w:b/>
+          <w:bCs/>
+        </w:rPr>
+        <w:t xml:space="preserve">Type:</w:t>
+      </w:r>
+      <w:r>
+        <w:t xml:space="preserve"> </w:t>
+      </w:r>
+      <w:r>
+        <w:t xml:space="preserve">Task</w:t>
+      </w:r>
+      <w:r>
+        <w:t xml:space="preserve"> </w:t>
+      </w:r>
+      <w:r>
+        <w:rPr>
+          <w:b/>
+          <w:bCs/>
+        </w:rPr>
+        <w:t xml:space="preserve">Severity:</w:t>
+      </w:r>
+      <w:r>
+        <w:t xml:space="preserve"> </w:t>
+      </w:r>
+      <w:r>
+        <w:t xml:space="preserve">Medium</w:t>
+      </w:r>
+      <w:r>
+        <w:t xml:space="preserve"> </w:t>
+      </w:r>
+      <w:r>
+        <w:rPr>
+          <w:b/>
+          <w:bCs/>
+        </w:rPr>
+        <w:t xml:space="preserve">Created-By:</w:t>
+      </w:r>
+      <w:r>
+        <w:t xml:space="preserve"> </w:t>
+      </w:r>
+      <w:r>
+        <w:t xml:space="preserve">Claude</w:t>
+      </w:r>
+    </w:p>
+    <w:p>
+      <w:pPr>
+        <w:pStyle w:val="BodyText"/>
+      </w:pPr>
+      <w:r>
+        <w:t xml:space="preserve">The e2e challenge runner advertises multiple interface modes (cli, rest, tui, websocket) but none of them actually exercises the HelixCode server’s real HTTP API during a run, so the challenges validate the runner’s own logic rather than the shipped server endpoints. This is a documentation-versus-implementation gap that weakens the end-to-end proof. The work is to wire the challenge runner’s interfaces to genuinely call the running server’s HTTP API so the challenges prove the real user-facing endpoints work. Discovered 2026-07-12 real-infra retest. Evidence: docs/qa/infra_retest_20260712_hxc122_138/hxc138_challenge_report.json.</w:t>
+      </w:r>
+    </w:p>
+    <w:bookmarkEnd w:id="20"/>
+    <w:bookmarkEnd w:id="21"/>
     <w:sectPr>
       <w:footnotePr>
         <w:numRestart w:val="eachSect"/>

</xml_diff>